<commit_message>
revised figures for clarity
</commit_message>
<xml_diff>
--- a/rmarkdown_tableknit/knit_model_tables.docx
+++ b/rmarkdown_tableknit/knit_model_tables.docx
@@ -28,7 +28,7 @@
         </w:rPr>
         <w:t xml:space="preserve">Table </w:t>
       </w:r>
-      <w:bookmarkStart w:id="b48f805c-aed6-4e91-b18b-726698a8235d" w:name="irtpartab"/>
+      <w:bookmarkStart w:id="6bc18818-24be-455b-8110-3a01cf7ef194" w:name="irtpartab"/>
       <w:r>
         <w:rPr>
           <w:rFonts w:ascii="Segoe UI" w:hAnsi="Segoe UI" w:eastAsia="Segoe UI" w:cs="Segoe UI"/>
@@ -65,7 +65,7 @@
         </w:rPr>
         <w:fldChar w:fldCharType="end" w:dirty="true"/>
       </w:r>
-      <w:bookmarkEnd w:id="b48f805c-aed6-4e91-b18b-726698a8235d"/>
+      <w:bookmarkEnd w:id="6bc18818-24be-455b-8110-3a01cf7ef194"/>
       <w:r>
         <w:rPr>
           <w:rFonts w:ascii="Segoe UI" w:hAnsi="Segoe UI" w:eastAsia="Segoe UI" w:cs="Segoe UI"/>
@@ -121,7 +121,6 @@
           </w:tcPr>
           <w:p>
             <w:pPr>
-              <w:pStyle w:val="Normal"/>
               <w:jc w:val="left"/>
               <w:pBdr>
                 <w:bottom w:val="none" w:sz="0" w:space="0" w:color="000000"/>
@@ -174,7 +173,6 @@
           </w:tcPr>
           <w:p>
             <w:pPr>
-              <w:pStyle w:val="Normal"/>
               <w:jc w:val="left"/>
               <w:pBdr>
                 <w:bottom w:val="none" w:sz="0" w:space="0" w:color="000000"/>
@@ -227,7 +225,6 @@
           </w:tcPr>
           <w:p>
             <w:pPr>
-              <w:pStyle w:val="Normal"/>
               <w:jc w:val="left"/>
               <w:pBdr>
                 <w:bottom w:val="none" w:sz="0" w:space="0" w:color="000000"/>
@@ -280,7 +277,6 @@
           </w:tcPr>
           <w:p>
             <w:pPr>
-              <w:pStyle w:val="Normal"/>
               <w:jc w:val="left"/>
               <w:pBdr>
                 <w:bottom w:val="none" w:sz="0" w:space="0" w:color="000000"/>
@@ -333,7 +329,6 @@
           </w:tcPr>
           <w:p>
             <w:pPr>
-              <w:pStyle w:val="Normal"/>
               <w:jc w:val="left"/>
               <w:pBdr>
                 <w:bottom w:val="none" w:sz="0" w:space="0" w:color="000000"/>
@@ -386,7 +381,6 @@
           </w:tcPr>
           <w:p>
             <w:pPr>
-              <w:pStyle w:val="Normal"/>
               <w:jc w:val="left"/>
               <w:pBdr>
                 <w:bottom w:val="none" w:sz="0" w:space="0" w:color="000000"/>
@@ -445,7 +439,6 @@
           </w:tcPr>
           <w:p>
             <w:pPr>
-              <w:pStyle w:val="Normal"/>
               <w:jc w:val="left"/>
               <w:pBdr>
                 <w:bottom w:val="none" w:sz="0" w:space="0" w:color="000000"/>
@@ -500,7 +493,6 @@
           </w:tcPr>
           <w:p>
             <w:pPr>
-              <w:pStyle w:val="Normal"/>
               <w:jc w:val="left"/>
               <w:pBdr>
                 <w:bottom w:val="none" w:sz="0" w:space="0" w:color="000000"/>
@@ -553,7 +545,6 @@
           </w:tcPr>
           <w:p>
             <w:pPr>
-              <w:pStyle w:val="Normal"/>
               <w:jc w:val="left"/>
               <w:pBdr>
                 <w:bottom w:val="none" w:sz="0" w:space="0" w:color="000000"/>
@@ -606,7 +597,6 @@
           </w:tcPr>
           <w:p>
             <w:pPr>
-              <w:pStyle w:val="Normal"/>
               <w:jc w:val="left"/>
               <w:pBdr>
                 <w:bottom w:val="none" w:sz="0" w:space="0" w:color="000000"/>
@@ -659,7 +649,6 @@
           </w:tcPr>
           <w:p>
             <w:pPr>
-              <w:pStyle w:val="Normal"/>
               <w:jc w:val="left"/>
               <w:pBdr>
                 <w:bottom w:val="none" w:sz="0" w:space="0" w:color="000000"/>
@@ -712,7 +701,6 @@
           </w:tcPr>
           <w:p>
             <w:pPr>
-              <w:pStyle w:val="Normal"/>
               <w:jc w:val="left"/>
               <w:pBdr>
                 <w:bottom w:val="none" w:sz="0" w:space="0" w:color="000000"/>
@@ -771,7 +759,6 @@
           </w:tcPr>
           <w:p>
             <w:pPr>
-              <w:pStyle w:val="Normal"/>
               <w:jc w:val="left"/>
               <w:pBdr>
                 <w:bottom w:val="none" w:sz="0" w:space="0" w:color="000000"/>
@@ -826,7 +813,6 @@
           </w:tcPr>
           <w:p>
             <w:pPr>
-              <w:pStyle w:val="Normal"/>
               <w:jc w:val="left"/>
               <w:pBdr>
                 <w:bottom w:val="none" w:sz="0" w:space="0" w:color="000000"/>
@@ -879,7 +865,6 @@
           </w:tcPr>
           <w:p>
             <w:pPr>
-              <w:pStyle w:val="Normal"/>
               <w:jc w:val="left"/>
               <w:pBdr>
                 <w:bottom w:val="none" w:sz="0" w:space="0" w:color="000000"/>
@@ -932,7 +917,6 @@
           </w:tcPr>
           <w:p>
             <w:pPr>
-              <w:pStyle w:val="Normal"/>
               <w:jc w:val="left"/>
               <w:pBdr>
                 <w:bottom w:val="none" w:sz="0" w:space="0" w:color="000000"/>
@@ -985,7 +969,6 @@
           </w:tcPr>
           <w:p>
             <w:pPr>
-              <w:pStyle w:val="Normal"/>
               <w:jc w:val="left"/>
               <w:pBdr>
                 <w:bottom w:val="none" w:sz="0" w:space="0" w:color="000000"/>
@@ -1038,7 +1021,6 @@
           </w:tcPr>
           <w:p>
             <w:pPr>
-              <w:pStyle w:val="Normal"/>
               <w:jc w:val="left"/>
               <w:pBdr>
                 <w:bottom w:val="none" w:sz="0" w:space="0" w:color="000000"/>
@@ -1097,7 +1079,6 @@
           </w:tcPr>
           <w:p>
             <w:pPr>
-              <w:pStyle w:val="Normal"/>
               <w:jc w:val="left"/>
               <w:pBdr>
                 <w:bottom w:val="none" w:sz="0" w:space="0" w:color="000000"/>
@@ -1143,7 +1124,6 @@
           </w:tcPr>
           <w:p>
             <w:pPr>
-              <w:pStyle w:val="Normal"/>
               <w:jc w:val="left"/>
               <w:pBdr>
                 <w:bottom w:val="none" w:sz="0" w:space="0" w:color="000000"/>
@@ -1196,7 +1176,6 @@
           </w:tcPr>
           <w:p>
             <w:pPr>
-              <w:pStyle w:val="Normal"/>
               <w:jc w:val="left"/>
               <w:pBdr>
                 <w:bottom w:val="none" w:sz="0" w:space="0" w:color="000000"/>
@@ -1249,7 +1228,6 @@
           </w:tcPr>
           <w:p>
             <w:pPr>
-              <w:pStyle w:val="Normal"/>
               <w:jc w:val="left"/>
               <w:pBdr>
                 <w:bottom w:val="none" w:sz="0" w:space="0" w:color="000000"/>
@@ -1302,7 +1280,6 @@
           </w:tcPr>
           <w:p>
             <w:pPr>
-              <w:pStyle w:val="Normal"/>
               <w:jc w:val="left"/>
               <w:pBdr>
                 <w:bottom w:val="none" w:sz="0" w:space="0" w:color="000000"/>
@@ -1355,7 +1332,6 @@
           </w:tcPr>
           <w:p>
             <w:pPr>
-              <w:pStyle w:val="Normal"/>
               <w:jc w:val="left"/>
               <w:pBdr>
                 <w:bottom w:val="none" w:sz="0" w:space="0" w:color="000000"/>
@@ -1414,7 +1390,6 @@
           </w:tcPr>
           <w:p>
             <w:pPr>
-              <w:pStyle w:val="Normal"/>
               <w:jc w:val="left"/>
               <w:pBdr>
                 <w:bottom w:val="none" w:sz="0" w:space="0" w:color="000000"/>
@@ -1469,7 +1444,6 @@
           </w:tcPr>
           <w:p>
             <w:pPr>
-              <w:pStyle w:val="Normal"/>
               <w:jc w:val="left"/>
               <w:pBdr>
                 <w:bottom w:val="none" w:sz="0" w:space="0" w:color="000000"/>
@@ -1522,7 +1496,6 @@
           </w:tcPr>
           <w:p>
             <w:pPr>
-              <w:pStyle w:val="Normal"/>
               <w:jc w:val="left"/>
               <w:pBdr>
                 <w:bottom w:val="none" w:sz="0" w:space="0" w:color="000000"/>
@@ -1575,7 +1548,6 @@
           </w:tcPr>
           <w:p>
             <w:pPr>
-              <w:pStyle w:val="Normal"/>
               <w:jc w:val="left"/>
               <w:pBdr>
                 <w:bottom w:val="none" w:sz="0" w:space="0" w:color="000000"/>
@@ -1628,7 +1600,6 @@
           </w:tcPr>
           <w:p>
             <w:pPr>
-              <w:pStyle w:val="Normal"/>
               <w:jc w:val="left"/>
               <w:pBdr>
                 <w:bottom w:val="none" w:sz="0" w:space="0" w:color="000000"/>
@@ -1681,7 +1652,6 @@
           </w:tcPr>
           <w:p>
             <w:pPr>
-              <w:pStyle w:val="Normal"/>
               <w:jc w:val="left"/>
               <w:pBdr>
                 <w:bottom w:val="none" w:sz="0" w:space="0" w:color="000000"/>
@@ -1740,7 +1710,6 @@
           </w:tcPr>
           <w:p>
             <w:pPr>
-              <w:pStyle w:val="Normal"/>
               <w:jc w:val="left"/>
               <w:pBdr>
                 <w:bottom w:val="none" w:sz="0" w:space="0" w:color="000000"/>
@@ -1795,7 +1764,6 @@
           </w:tcPr>
           <w:p>
             <w:pPr>
-              <w:pStyle w:val="Normal"/>
               <w:jc w:val="left"/>
               <w:pBdr>
                 <w:bottom w:val="none" w:sz="0" w:space="0" w:color="000000"/>
@@ -1848,7 +1816,6 @@
           </w:tcPr>
           <w:p>
             <w:pPr>
-              <w:pStyle w:val="Normal"/>
               <w:jc w:val="left"/>
               <w:pBdr>
                 <w:bottom w:val="none" w:sz="0" w:space="0" w:color="000000"/>
@@ -1901,7 +1868,6 @@
           </w:tcPr>
           <w:p>
             <w:pPr>
-              <w:pStyle w:val="Normal"/>
               <w:jc w:val="left"/>
               <w:pBdr>
                 <w:bottom w:val="none" w:sz="0" w:space="0" w:color="000000"/>
@@ -1954,7 +1920,6 @@
           </w:tcPr>
           <w:p>
             <w:pPr>
-              <w:pStyle w:val="Normal"/>
               <w:jc w:val="left"/>
               <w:pBdr>
                 <w:bottom w:val="none" w:sz="0" w:space="0" w:color="000000"/>
@@ -2007,7 +1972,6 @@
           </w:tcPr>
           <w:p>
             <w:pPr>
-              <w:pStyle w:val="Normal"/>
               <w:jc w:val="left"/>
               <w:pBdr>
                 <w:bottom w:val="none" w:sz="0" w:space="0" w:color="000000"/>
@@ -2066,7 +2030,6 @@
           </w:tcPr>
           <w:p>
             <w:pPr>
-              <w:pStyle w:val="Normal"/>
               <w:jc w:val="left"/>
               <w:pBdr>
                 <w:bottom w:val="none" w:sz="0" w:space="0" w:color="000000"/>
@@ -2121,7 +2084,6 @@
           </w:tcPr>
           <w:p>
             <w:pPr>
-              <w:pStyle w:val="Normal"/>
               <w:jc w:val="left"/>
               <w:pBdr>
                 <w:bottom w:val="none" w:sz="0" w:space="0" w:color="000000"/>
@@ -2174,7 +2136,6 @@
           </w:tcPr>
           <w:p>
             <w:pPr>
-              <w:pStyle w:val="Normal"/>
               <w:jc w:val="left"/>
               <w:pBdr>
                 <w:bottom w:val="none" w:sz="0" w:space="0" w:color="000000"/>
@@ -2227,7 +2188,6 @@
           </w:tcPr>
           <w:p>
             <w:pPr>
-              <w:pStyle w:val="Normal"/>
               <w:jc w:val="left"/>
               <w:pBdr>
                 <w:bottom w:val="none" w:sz="0" w:space="0" w:color="000000"/>
@@ -2280,7 +2240,6 @@
           </w:tcPr>
           <w:p>
             <w:pPr>
-              <w:pStyle w:val="Normal"/>
               <w:jc w:val="left"/>
               <w:pBdr>
                 <w:bottom w:val="none" w:sz="0" w:space="0" w:color="000000"/>
@@ -2333,7 +2292,6 @@
           </w:tcPr>
           <w:p>
             <w:pPr>
-              <w:pStyle w:val="Normal"/>
               <w:jc w:val="left"/>
               <w:pBdr>
                 <w:bottom w:val="none" w:sz="0" w:space="0" w:color="000000"/>
@@ -2392,7 +2350,6 @@
           </w:tcPr>
           <w:p>
             <w:pPr>
-              <w:pStyle w:val="Normal"/>
               <w:jc w:val="left"/>
               <w:pBdr>
                 <w:bottom w:val="none" w:sz="0" w:space="0" w:color="000000"/>
@@ -2447,7 +2404,6 @@
           </w:tcPr>
           <w:p>
             <w:pPr>
-              <w:pStyle w:val="Normal"/>
               <w:jc w:val="left"/>
               <w:pBdr>
                 <w:bottom w:val="none" w:sz="0" w:space="0" w:color="000000"/>
@@ -2500,7 +2456,6 @@
           </w:tcPr>
           <w:p>
             <w:pPr>
-              <w:pStyle w:val="Normal"/>
               <w:jc w:val="left"/>
               <w:pBdr>
                 <w:bottom w:val="none" w:sz="0" w:space="0" w:color="000000"/>
@@ -2553,7 +2508,6 @@
           </w:tcPr>
           <w:p>
             <w:pPr>
-              <w:pStyle w:val="Normal"/>
               <w:jc w:val="left"/>
               <w:pBdr>
                 <w:bottom w:val="none" w:sz="0" w:space="0" w:color="000000"/>
@@ -2606,7 +2560,6 @@
           </w:tcPr>
           <w:p>
             <w:pPr>
-              <w:pStyle w:val="Normal"/>
               <w:jc w:val="left"/>
               <w:pBdr>
                 <w:bottom w:val="none" w:sz="0" w:space="0" w:color="000000"/>
@@ -2659,7 +2612,6 @@
           </w:tcPr>
           <w:p>
             <w:pPr>
-              <w:pStyle w:val="Normal"/>
               <w:jc w:val="left"/>
               <w:pBdr>
                 <w:bottom w:val="none" w:sz="0" w:space="0" w:color="000000"/>
@@ -2718,7 +2670,6 @@
           </w:tcPr>
           <w:p>
             <w:pPr>
-              <w:pStyle w:val="Normal"/>
               <w:jc w:val="left"/>
               <w:pBdr>
                 <w:bottom w:val="none" w:sz="0" w:space="0" w:color="000000"/>
@@ -2773,7 +2724,6 @@
           </w:tcPr>
           <w:p>
             <w:pPr>
-              <w:pStyle w:val="Normal"/>
               <w:jc w:val="left"/>
               <w:pBdr>
                 <w:bottom w:val="none" w:sz="0" w:space="0" w:color="000000"/>
@@ -2826,7 +2776,6 @@
           </w:tcPr>
           <w:p>
             <w:pPr>
-              <w:pStyle w:val="Normal"/>
               <w:jc w:val="left"/>
               <w:pBdr>
                 <w:bottom w:val="none" w:sz="0" w:space="0" w:color="000000"/>
@@ -2879,7 +2828,6 @@
           </w:tcPr>
           <w:p>
             <w:pPr>
-              <w:pStyle w:val="Normal"/>
               <w:jc w:val="left"/>
               <w:pBdr>
                 <w:bottom w:val="none" w:sz="0" w:space="0" w:color="000000"/>
@@ -2932,7 +2880,6 @@
           </w:tcPr>
           <w:p>
             <w:pPr>
-              <w:pStyle w:val="Normal"/>
               <w:jc w:val="left"/>
               <w:pBdr>
                 <w:bottom w:val="none" w:sz="0" w:space="0" w:color="000000"/>
@@ -2985,7 +2932,6 @@
           </w:tcPr>
           <w:p>
             <w:pPr>
-              <w:pStyle w:val="Normal"/>
               <w:jc w:val="left"/>
               <w:pBdr>
                 <w:bottom w:val="none" w:sz="0" w:space="0" w:color="000000"/>
@@ -3044,7 +2990,6 @@
           </w:tcPr>
           <w:p>
             <w:pPr>
-              <w:pStyle w:val="Normal"/>
               <w:jc w:val="left"/>
               <w:pBdr>
                 <w:bottom w:val="none" w:sz="0" w:space="0" w:color="000000"/>
@@ -3099,7 +3044,6 @@
           </w:tcPr>
           <w:p>
             <w:pPr>
-              <w:pStyle w:val="Normal"/>
               <w:jc w:val="left"/>
               <w:pBdr>
                 <w:bottom w:val="none" w:sz="0" w:space="0" w:color="000000"/>
@@ -3152,7 +3096,6 @@
           </w:tcPr>
           <w:p>
             <w:pPr>
-              <w:pStyle w:val="Normal"/>
               <w:jc w:val="left"/>
               <w:pBdr>
                 <w:bottom w:val="none" w:sz="0" w:space="0" w:color="000000"/>
@@ -3205,7 +3148,6 @@
           </w:tcPr>
           <w:p>
             <w:pPr>
-              <w:pStyle w:val="Normal"/>
               <w:jc w:val="left"/>
               <w:pBdr>
                 <w:bottom w:val="none" w:sz="0" w:space="0" w:color="000000"/>
@@ -3258,7 +3200,6 @@
           </w:tcPr>
           <w:p>
             <w:pPr>
-              <w:pStyle w:val="Normal"/>
               <w:jc w:val="left"/>
               <w:pBdr>
                 <w:bottom w:val="none" w:sz="0" w:space="0" w:color="000000"/>
@@ -3311,7 +3252,6 @@
           </w:tcPr>
           <w:p>
             <w:pPr>
-              <w:pStyle w:val="Normal"/>
               <w:jc w:val="left"/>
               <w:pBdr>
                 <w:bottom w:val="none" w:sz="0" w:space="0" w:color="000000"/>
@@ -3370,7 +3310,6 @@
           </w:tcPr>
           <w:p>
             <w:pPr>
-              <w:pStyle w:val="Normal"/>
               <w:jc w:val="left"/>
               <w:pBdr>
                 <w:bottom w:val="none" w:sz="0" w:space="0" w:color="000000"/>
@@ -3428,7 +3367,6 @@
           </w:tcPr>
           <w:p>
             <w:pPr>
-              <w:pStyle w:val="Normal"/>
               <w:jc w:val="left"/>
               <w:pBdr>
                 <w:bottom w:val="none" w:sz="0" w:space="0" w:color="000000"/>
@@ -3481,7 +3419,6 @@
           </w:tcPr>
           <w:p>
             <w:pPr>
-              <w:pStyle w:val="Normal"/>
               <w:jc w:val="left"/>
               <w:pBdr>
                 <w:bottom w:val="none" w:sz="0" w:space="0" w:color="000000"/>
@@ -3534,7 +3471,6 @@
           </w:tcPr>
           <w:p>
             <w:pPr>
-              <w:pStyle w:val="Normal"/>
               <w:jc w:val="left"/>
               <w:pBdr>
                 <w:bottom w:val="none" w:sz="0" w:space="0" w:color="000000"/>
@@ -3587,7 +3523,6 @@
           </w:tcPr>
           <w:p>
             <w:pPr>
-              <w:pStyle w:val="Normal"/>
               <w:jc w:val="left"/>
               <w:pBdr>
                 <w:bottom w:val="none" w:sz="0" w:space="0" w:color="000000"/>
@@ -3640,7 +3575,6 @@
           </w:tcPr>
           <w:p>
             <w:pPr>
-              <w:pStyle w:val="Normal"/>
               <w:jc w:val="left"/>
               <w:pBdr>
                 <w:bottom w:val="none" w:sz="0" w:space="0" w:color="000000"/>
@@ -3699,7 +3633,6 @@
           </w:tcPr>
           <w:p>
             <w:pPr>
-              <w:pStyle w:val="Normal"/>
               <w:jc w:val="left"/>
               <w:pBdr>
                 <w:bottom w:val="none" w:sz="0" w:space="0" w:color="000000"/>
@@ -3757,7 +3690,6 @@
           </w:tcPr>
           <w:p>
             <w:pPr>
-              <w:pStyle w:val="Normal"/>
               <w:jc w:val="left"/>
               <w:pBdr>
                 <w:bottom w:val="none" w:sz="0" w:space="0" w:color="000000"/>
@@ -3810,7 +3742,6 @@
           </w:tcPr>
           <w:p>
             <w:pPr>
-              <w:pStyle w:val="Normal"/>
               <w:jc w:val="left"/>
               <w:pBdr>
                 <w:bottom w:val="none" w:sz="0" w:space="0" w:color="000000"/>
@@ -3863,7 +3794,6 @@
           </w:tcPr>
           <w:p>
             <w:pPr>
-              <w:pStyle w:val="Normal"/>
               <w:jc w:val="left"/>
               <w:pBdr>
                 <w:bottom w:val="none" w:sz="0" w:space="0" w:color="000000"/>
@@ -3916,7 +3846,6 @@
           </w:tcPr>
           <w:p>
             <w:pPr>
-              <w:pStyle w:val="Normal"/>
               <w:jc w:val="left"/>
               <w:pBdr>
                 <w:bottom w:val="none" w:sz="0" w:space="0" w:color="000000"/>
@@ -3969,7 +3898,6 @@
           </w:tcPr>
           <w:p>
             <w:pPr>
-              <w:pStyle w:val="Normal"/>
               <w:jc w:val="left"/>
               <w:pBdr>
                 <w:bottom w:val="none" w:sz="0" w:space="0" w:color="000000"/>
@@ -4028,7 +3956,6 @@
           </w:tcPr>
           <w:p>
             <w:pPr>
-              <w:pStyle w:val="Normal"/>
               <w:jc w:val="left"/>
               <w:pBdr>
                 <w:bottom w:val="none" w:sz="0" w:space="0" w:color="000000"/>
@@ -4083,7 +4010,6 @@
           </w:tcPr>
           <w:p>
             <w:pPr>
-              <w:pStyle w:val="Normal"/>
               <w:jc w:val="left"/>
               <w:pBdr>
                 <w:bottom w:val="none" w:sz="0" w:space="0" w:color="000000"/>
@@ -4136,7 +4062,6 @@
           </w:tcPr>
           <w:p>
             <w:pPr>
-              <w:pStyle w:val="Normal"/>
               <w:jc w:val="left"/>
               <w:pBdr>
                 <w:bottom w:val="none" w:sz="0" w:space="0" w:color="000000"/>
@@ -4189,7 +4114,6 @@
           </w:tcPr>
           <w:p>
             <w:pPr>
-              <w:pStyle w:val="Normal"/>
               <w:jc w:val="left"/>
               <w:pBdr>
                 <w:bottom w:val="none" w:sz="0" w:space="0" w:color="000000"/>
@@ -4242,7 +4166,6 @@
           </w:tcPr>
           <w:p>
             <w:pPr>
-              <w:pStyle w:val="Normal"/>
               <w:jc w:val="left"/>
               <w:pBdr>
                 <w:bottom w:val="none" w:sz="0" w:space="0" w:color="000000"/>
@@ -4295,7 +4218,6 @@
           </w:tcPr>
           <w:p>
             <w:pPr>
-              <w:pStyle w:val="Normal"/>
               <w:jc w:val="left"/>
               <w:pBdr>
                 <w:bottom w:val="none" w:sz="0" w:space="0" w:color="000000"/>
@@ -4354,7 +4276,6 @@
           </w:tcPr>
           <w:p>
             <w:pPr>
-              <w:pStyle w:val="Normal"/>
               <w:jc w:val="left"/>
               <w:pBdr>
                 <w:bottom w:val="none" w:sz="0" w:space="0" w:color="000000"/>
@@ -4421,7 +4342,6 @@
           </w:tcPr>
           <w:p>
             <w:pPr>
-              <w:pStyle w:val="Normal"/>
               <w:jc w:val="left"/>
               <w:pBdr>
                 <w:bottom w:val="none" w:sz="0" w:space="0" w:color="000000"/>
@@ -4474,7 +4394,6 @@
           </w:tcPr>
           <w:p>
             <w:pPr>
-              <w:pStyle w:val="Normal"/>
               <w:jc w:val="left"/>
               <w:pBdr>
                 <w:bottom w:val="none" w:sz="0" w:space="0" w:color="000000"/>
@@ -4527,7 +4446,6 @@
           </w:tcPr>
           <w:p>
             <w:pPr>
-              <w:pStyle w:val="Normal"/>
               <w:jc w:val="left"/>
               <w:pBdr>
                 <w:bottom w:val="none" w:sz="0" w:space="0" w:color="000000"/>
@@ -4580,7 +4498,6 @@
           </w:tcPr>
           <w:p>
             <w:pPr>
-              <w:pStyle w:val="Normal"/>
               <w:jc w:val="left"/>
               <w:pBdr>
                 <w:bottom w:val="none" w:sz="0" w:space="0" w:color="000000"/>
@@ -4633,7 +4550,6 @@
           </w:tcPr>
           <w:p>
             <w:pPr>
-              <w:pStyle w:val="Normal"/>
               <w:jc w:val="left"/>
               <w:pBdr>
                 <w:bottom w:val="none" w:sz="0" w:space="0" w:color="000000"/>
@@ -4693,7 +4609,6 @@
           </w:tcPr>
           <w:p>
             <w:pPr>
-              <w:pStyle w:val="Normal"/>
               <w:jc w:val="left"/>
               <w:pBdr>
                 <w:bottom w:val="none" w:sz="0" w:space="0" w:color="000000"/>
@@ -4760,7 +4675,7 @@
         </w:rPr>
         <w:t xml:space="preserve">Table </w:t>
       </w:r>
-      <w:bookmarkStart w:id="0f13865b-2ce0-49a0-9037-6b0b4cec234a" w:name="barepartab"/>
+      <w:bookmarkStart w:id="d8159e92-9f21-46e7-b377-629b086ce418" w:name="barepartab"/>
       <w:r>
         <w:rPr>
           <w:rFonts w:ascii="Segoe UI" w:hAnsi="Segoe UI" w:eastAsia="Segoe UI" w:cs="Segoe UI"/>
@@ -4797,7 +4712,7 @@
         </w:rPr>
         <w:fldChar w:fldCharType="end" w:dirty="true"/>
       </w:r>
-      <w:bookmarkEnd w:id="0f13865b-2ce0-49a0-9037-6b0b4cec234a"/>
+      <w:bookmarkEnd w:id="d8159e92-9f21-46e7-b377-629b086ce418"/>
       <w:r>
         <w:rPr>
           <w:rFonts w:ascii="Segoe UI" w:hAnsi="Segoe UI" w:eastAsia="Segoe UI" w:cs="Segoe UI"/>
@@ -4853,7 +4768,6 @@
           </w:tcPr>
           <w:p>
             <w:pPr>
-              <w:pStyle w:val="Normal"/>
               <w:jc w:val="left"/>
               <w:pBdr>
                 <w:bottom w:val="none" w:sz="0" w:space="0" w:color="000000"/>
@@ -4906,7 +4820,6 @@
           </w:tcPr>
           <w:p>
             <w:pPr>
-              <w:pStyle w:val="Normal"/>
               <w:jc w:val="left"/>
               <w:pBdr>
                 <w:bottom w:val="none" w:sz="0" w:space="0" w:color="000000"/>
@@ -4959,7 +4872,6 @@
           </w:tcPr>
           <w:p>
             <w:pPr>
-              <w:pStyle w:val="Normal"/>
               <w:jc w:val="left"/>
               <w:pBdr>
                 <w:bottom w:val="none" w:sz="0" w:space="0" w:color="000000"/>
@@ -5012,7 +4924,6 @@
           </w:tcPr>
           <w:p>
             <w:pPr>
-              <w:pStyle w:val="Normal"/>
               <w:jc w:val="left"/>
               <w:pBdr>
                 <w:bottom w:val="none" w:sz="0" w:space="0" w:color="000000"/>
@@ -5065,7 +4976,6 @@
           </w:tcPr>
           <w:p>
             <w:pPr>
-              <w:pStyle w:val="Normal"/>
               <w:jc w:val="left"/>
               <w:pBdr>
                 <w:bottom w:val="none" w:sz="0" w:space="0" w:color="000000"/>
@@ -5118,7 +5028,6 @@
           </w:tcPr>
           <w:p>
             <w:pPr>
-              <w:pStyle w:val="Normal"/>
               <w:jc w:val="left"/>
               <w:pBdr>
                 <w:bottom w:val="none" w:sz="0" w:space="0" w:color="000000"/>
@@ -5177,7 +5086,6 @@
           </w:tcPr>
           <w:p>
             <w:pPr>
-              <w:pStyle w:val="Normal"/>
               <w:jc w:val="left"/>
               <w:pBdr>
                 <w:bottom w:val="none" w:sz="0" w:space="0" w:color="000000"/>
@@ -5232,7 +5140,6 @@
           </w:tcPr>
           <w:p>
             <w:pPr>
-              <w:pStyle w:val="Normal"/>
               <w:jc w:val="left"/>
               <w:pBdr>
                 <w:bottom w:val="none" w:sz="0" w:space="0" w:color="000000"/>
@@ -5285,7 +5192,6 @@
           </w:tcPr>
           <w:p>
             <w:pPr>
-              <w:pStyle w:val="Normal"/>
               <w:jc w:val="left"/>
               <w:pBdr>
                 <w:bottom w:val="none" w:sz="0" w:space="0" w:color="000000"/>
@@ -5338,7 +5244,6 @@
           </w:tcPr>
           <w:p>
             <w:pPr>
-              <w:pStyle w:val="Normal"/>
               <w:jc w:val="left"/>
               <w:pBdr>
                 <w:bottom w:val="none" w:sz="0" w:space="0" w:color="000000"/>
@@ -5391,7 +5296,6 @@
           </w:tcPr>
           <w:p>
             <w:pPr>
-              <w:pStyle w:val="Normal"/>
               <w:jc w:val="left"/>
               <w:pBdr>
                 <w:bottom w:val="none" w:sz="0" w:space="0" w:color="000000"/>
@@ -5444,7 +5348,6 @@
           </w:tcPr>
           <w:p>
             <w:pPr>
-              <w:pStyle w:val="Normal"/>
               <w:jc w:val="left"/>
               <w:pBdr>
                 <w:bottom w:val="none" w:sz="0" w:space="0" w:color="000000"/>
@@ -5503,7 +5406,6 @@
           </w:tcPr>
           <w:p>
             <w:pPr>
-              <w:pStyle w:val="Normal"/>
               <w:jc w:val="left"/>
               <w:pBdr>
                 <w:bottom w:val="none" w:sz="0" w:space="0" w:color="000000"/>
@@ -5558,7 +5460,6 @@
           </w:tcPr>
           <w:p>
             <w:pPr>
-              <w:pStyle w:val="Normal"/>
               <w:jc w:val="left"/>
               <w:pBdr>
                 <w:bottom w:val="none" w:sz="0" w:space="0" w:color="000000"/>
@@ -5611,7 +5512,6 @@
           </w:tcPr>
           <w:p>
             <w:pPr>
-              <w:pStyle w:val="Normal"/>
               <w:jc w:val="left"/>
               <w:pBdr>
                 <w:bottom w:val="none" w:sz="0" w:space="0" w:color="000000"/>
@@ -5664,7 +5564,6 @@
           </w:tcPr>
           <w:p>
             <w:pPr>
-              <w:pStyle w:val="Normal"/>
               <w:jc w:val="left"/>
               <w:pBdr>
                 <w:bottom w:val="none" w:sz="0" w:space="0" w:color="000000"/>
@@ -5717,7 +5616,6 @@
           </w:tcPr>
           <w:p>
             <w:pPr>
-              <w:pStyle w:val="Normal"/>
               <w:jc w:val="left"/>
               <w:pBdr>
                 <w:bottom w:val="none" w:sz="0" w:space="0" w:color="000000"/>
@@ -5770,7 +5668,6 @@
           </w:tcPr>
           <w:p>
             <w:pPr>
-              <w:pStyle w:val="Normal"/>
               <w:jc w:val="left"/>
               <w:pBdr>
                 <w:bottom w:val="none" w:sz="0" w:space="0" w:color="000000"/>
@@ -5829,7 +5726,6 @@
           </w:tcPr>
           <w:p>
             <w:pPr>
-              <w:pStyle w:val="Normal"/>
               <w:jc w:val="left"/>
               <w:pBdr>
                 <w:bottom w:val="none" w:sz="0" w:space="0" w:color="000000"/>
@@ -5884,7 +5780,6 @@
           </w:tcPr>
           <w:p>
             <w:pPr>
-              <w:pStyle w:val="Normal"/>
               <w:jc w:val="left"/>
               <w:pBdr>
                 <w:bottom w:val="none" w:sz="0" w:space="0" w:color="000000"/>
@@ -5937,7 +5832,6 @@
           </w:tcPr>
           <w:p>
             <w:pPr>
-              <w:pStyle w:val="Normal"/>
               <w:jc w:val="left"/>
               <w:pBdr>
                 <w:bottom w:val="none" w:sz="0" w:space="0" w:color="000000"/>
@@ -5990,7 +5884,6 @@
           </w:tcPr>
           <w:p>
             <w:pPr>
-              <w:pStyle w:val="Normal"/>
               <w:jc w:val="left"/>
               <w:pBdr>
                 <w:bottom w:val="none" w:sz="0" w:space="0" w:color="000000"/>
@@ -6043,7 +5936,6 @@
           </w:tcPr>
           <w:p>
             <w:pPr>
-              <w:pStyle w:val="Normal"/>
               <w:jc w:val="left"/>
               <w:pBdr>
                 <w:bottom w:val="none" w:sz="0" w:space="0" w:color="000000"/>
@@ -6096,7 +5988,6 @@
           </w:tcPr>
           <w:p>
             <w:pPr>
-              <w:pStyle w:val="Normal"/>
               <w:jc w:val="left"/>
               <w:pBdr>
                 <w:bottom w:val="none" w:sz="0" w:space="0" w:color="000000"/>
@@ -6155,7 +6046,6 @@
           </w:tcPr>
           <w:p>
             <w:pPr>
-              <w:pStyle w:val="Normal"/>
               <w:jc w:val="left"/>
               <w:pBdr>
                 <w:bottom w:val="none" w:sz="0" w:space="0" w:color="000000"/>
@@ -6210,7 +6100,6 @@
           </w:tcPr>
           <w:p>
             <w:pPr>
-              <w:pStyle w:val="Normal"/>
               <w:jc w:val="left"/>
               <w:pBdr>
                 <w:bottom w:val="none" w:sz="0" w:space="0" w:color="000000"/>
@@ -6263,7 +6152,6 @@
           </w:tcPr>
           <w:p>
             <w:pPr>
-              <w:pStyle w:val="Normal"/>
               <w:jc w:val="left"/>
               <w:pBdr>
                 <w:bottom w:val="none" w:sz="0" w:space="0" w:color="000000"/>
@@ -6316,7 +6204,6 @@
           </w:tcPr>
           <w:p>
             <w:pPr>
-              <w:pStyle w:val="Normal"/>
               <w:jc w:val="left"/>
               <w:pBdr>
                 <w:bottom w:val="none" w:sz="0" w:space="0" w:color="000000"/>
@@ -6369,7 +6256,6 @@
           </w:tcPr>
           <w:p>
             <w:pPr>
-              <w:pStyle w:val="Normal"/>
               <w:jc w:val="left"/>
               <w:pBdr>
                 <w:bottom w:val="none" w:sz="0" w:space="0" w:color="000000"/>
@@ -6422,7 +6308,6 @@
           </w:tcPr>
           <w:p>
             <w:pPr>
-              <w:pStyle w:val="Normal"/>
               <w:jc w:val="left"/>
               <w:pBdr>
                 <w:bottom w:val="none" w:sz="0" w:space="0" w:color="000000"/>
@@ -6481,7 +6366,6 @@
           </w:tcPr>
           <w:p>
             <w:pPr>
-              <w:pStyle w:val="Normal"/>
               <w:jc w:val="left"/>
               <w:pBdr>
                 <w:bottom w:val="none" w:sz="0" w:space="0" w:color="000000"/>
@@ -6536,7 +6420,6 @@
           </w:tcPr>
           <w:p>
             <w:pPr>
-              <w:pStyle w:val="Normal"/>
               <w:jc w:val="left"/>
               <w:pBdr>
                 <w:bottom w:val="none" w:sz="0" w:space="0" w:color="000000"/>
@@ -6589,7 +6472,6 @@
           </w:tcPr>
           <w:p>
             <w:pPr>
-              <w:pStyle w:val="Normal"/>
               <w:jc w:val="left"/>
               <w:pBdr>
                 <w:bottom w:val="none" w:sz="0" w:space="0" w:color="000000"/>
@@ -6642,7 +6524,6 @@
           </w:tcPr>
           <w:p>
             <w:pPr>
-              <w:pStyle w:val="Normal"/>
               <w:jc w:val="left"/>
               <w:pBdr>
                 <w:bottom w:val="none" w:sz="0" w:space="0" w:color="000000"/>
@@ -6695,7 +6576,6 @@
           </w:tcPr>
           <w:p>
             <w:pPr>
-              <w:pStyle w:val="Normal"/>
               <w:jc w:val="left"/>
               <w:pBdr>
                 <w:bottom w:val="none" w:sz="0" w:space="0" w:color="000000"/>
@@ -6748,7 +6628,6 @@
           </w:tcPr>
           <w:p>
             <w:pPr>
-              <w:pStyle w:val="Normal"/>
               <w:jc w:val="left"/>
               <w:pBdr>
                 <w:bottom w:val="none" w:sz="0" w:space="0" w:color="000000"/>
@@ -6807,7 +6686,6 @@
           </w:tcPr>
           <w:p>
             <w:pPr>
-              <w:pStyle w:val="Normal"/>
               <w:jc w:val="left"/>
               <w:pBdr>
                 <w:bottom w:val="none" w:sz="0" w:space="0" w:color="000000"/>
@@ -6853,7 +6731,6 @@
           </w:tcPr>
           <w:p>
             <w:pPr>
-              <w:pStyle w:val="Normal"/>
               <w:jc w:val="left"/>
               <w:pBdr>
                 <w:bottom w:val="none" w:sz="0" w:space="0" w:color="000000"/>
@@ -6906,7 +6783,6 @@
           </w:tcPr>
           <w:p>
             <w:pPr>
-              <w:pStyle w:val="Normal"/>
               <w:jc w:val="left"/>
               <w:pBdr>
                 <w:bottom w:val="none" w:sz="0" w:space="0" w:color="000000"/>
@@ -6959,7 +6835,6 @@
           </w:tcPr>
           <w:p>
             <w:pPr>
-              <w:pStyle w:val="Normal"/>
               <w:jc w:val="left"/>
               <w:pBdr>
                 <w:bottom w:val="none" w:sz="0" w:space="0" w:color="000000"/>
@@ -7012,7 +6887,6 @@
           </w:tcPr>
           <w:p>
             <w:pPr>
-              <w:pStyle w:val="Normal"/>
               <w:jc w:val="left"/>
               <w:pBdr>
                 <w:bottom w:val="none" w:sz="0" w:space="0" w:color="000000"/>
@@ -7065,7 +6939,6 @@
           </w:tcPr>
           <w:p>
             <w:pPr>
-              <w:pStyle w:val="Normal"/>
               <w:jc w:val="left"/>
               <w:pBdr>
                 <w:bottom w:val="none" w:sz="0" w:space="0" w:color="000000"/>
@@ -7125,7 +6998,6 @@
           </w:tcPr>
           <w:p>
             <w:pPr>
-              <w:pStyle w:val="Normal"/>
               <w:jc w:val="left"/>
               <w:pBdr>
                 <w:bottom w:val="none" w:sz="0" w:space="0" w:color="000000"/>
@@ -7167,7 +7039,6 @@
       <w:pgSz w:h="15840" w:w="12240"/>
       <w:pgMar w:bottom="1417" w:footer="720" w:gutter="0" w:header="720" w:left="1417" w:right="1417" w:top="1417"/>
       <w:cols w:space="720"/>
-      <w:type w:val="continuous"/>
     </w:sectPr>
   </w:body>
 </w:document>

</xml_diff>